<commit_message>
docs: corregir tablas de resumen y escenarios de aceptación - Lab 16
</commit_message>
<xml_diff>
--- a/docs/acceptance-tests/Laboratorio_16_Pruebas_Aceptacion_Gherkin_Dixson_Apaza.docx
+++ b/docs/acceptance-tests/Laboratorio_16_Pruebas_Aceptacion_Gherkin_Dixson_Apaza.docx
@@ -10648,14 +10648,16 @@
             </w:tcMar>
           </w:tcPr>
           <w:p>
-            <w:r>
-              <w:rPr>
-                <w:rFonts w:ascii="Calibri" w:hAnsi="Calibri"/>
-                <w:color w:val="000000"/>
-                <w:sz w:val="20"/>
-              </w:rPr>
-              <w:t>Parcial / Fallido</w:t>
-            </w:r>
+            <w:proofErr w:type="spellStart"/>
+            <w:r>
+              <w:rPr>
+                <w:rFonts w:ascii="Calibri" w:hAnsi="Calibri"/>
+                <w:color w:val="000000"/>
+                <w:sz w:val="20"/>
+              </w:rPr>
+              <w:t>Fallido</w:t>
+            </w:r>
+            <w:proofErr w:type="spellEnd"/>
           </w:p>
         </w:tc>
       </w:tr>
@@ -13720,16 +13722,13 @@
             </w:pPr>
             <w:r>
               <w:rPr>
-                <w:rFonts w:ascii="Calibri" w:hAnsi="Calibri"/>
-                <w:b/>
-                <w:color w:val="666666"/>
                 <w:lang w:val="es-PE"/>
               </w:rPr>
               <w:drawing>
-                <wp:inline distT="0" distB="0" distL="0" distR="0" wp14:anchorId="39A722F9" wp14:editId="5BF57A1B">
-                  <wp:extent cx="5506085" cy="1945005"/>
-                  <wp:effectExtent l="0" t="0" r="0" b="0"/>
-                  <wp:docPr id="181884607" name="Imagen 1"/>
+                <wp:inline distT="0" distB="0" distL="0" distR="0" wp14:anchorId="5655821A" wp14:editId="296D0C51">
+                  <wp:extent cx="5506085" cy="2334895"/>
+                  <wp:effectExtent l="0" t="0" r="0" b="8255"/>
+                  <wp:docPr id="150752109" name="Imagen 1"/>
                   <wp:cNvGraphicFramePr>
                     <a:graphicFrameLocks xmlns:a="http://schemas.openxmlformats.org/drawingml/2006/main" noChangeAspect="1"/>
                   </wp:cNvGraphicFramePr>
@@ -13737,7 +13736,7 @@
                     <a:graphicData uri="http://schemas.openxmlformats.org/drawingml/2006/picture">
                       <pic:pic xmlns:pic="http://schemas.openxmlformats.org/drawingml/2006/picture">
                         <pic:nvPicPr>
-                          <pic:cNvPr id="181884607" name=""/>
+                          <pic:cNvPr id="150752109" name=""/>
                           <pic:cNvPicPr/>
                         </pic:nvPicPr>
                         <pic:blipFill>
@@ -13749,7 +13748,7 @@
                         <pic:spPr>
                           <a:xfrm>
                             <a:off x="0" y="0"/>
-                            <a:ext cx="5506085" cy="1945005"/>
+                            <a:ext cx="5506085" cy="2334895"/>
                           </a:xfrm>
                           <a:prstGeom prst="rect">
                             <a:avLst/>
@@ -13797,6 +13796,7 @@
           <w:color w:val="000000"/>
           <w:lang w:val="es-PE"/>
         </w:rPr>
+        <w:lastRenderedPageBreak/>
         <w:t>Descripción: Esta evidencia consolida los resultados de aceptación ejecutados manualmente.</w:t>
       </w:r>
     </w:p>
@@ -13812,7 +13812,6 @@
           <w:color w:val="000000"/>
           <w:sz w:val="32"/>
         </w:rPr>
-        <w:lastRenderedPageBreak/>
         <w:t>14. Resumen de Resultados</w:t>
       </w:r>
     </w:p>
@@ -14431,6 +14430,142 @@
         <w:tc>
           <w:tcPr>
             <w:tcW w:w="2268" w:type="dxa"/>
+            <w:shd w:val="clear" w:color="auto" w:fill="F2F2F2"/>
+            <w:tcMar>
+              <w:top w:w="100" w:type="dxa"/>
+              <w:left w:w="150" w:type="dxa"/>
+              <w:bottom w:w="100" w:type="dxa"/>
+              <w:right w:w="150" w:type="dxa"/>
+            </w:tcMar>
+          </w:tcPr>
+          <w:p>
+            <w:pPr>
+              <w:spacing w:after="0" w:line="276" w:lineRule="auto"/>
+            </w:pPr>
+            <w:r>
+              <w:rPr>
+                <w:rFonts w:ascii="Calibri" w:hAnsi="Calibri"/>
+                <w:b w:val="0"/>
+                <w:color w:val="000000"/>
+                <w:sz w:val="20"/>
+              </w:rPr>
+              <w:t>HU-05</w:t>
+            </w:r>
+          </w:p>
+        </w:tc>
+        <w:tc>
+          <w:tcPr>
+            <w:tcW w:w="1417" w:type="dxa"/>
+            <w:shd w:val="clear" w:color="auto" w:fill="F2F2F2"/>
+            <w:tcMar>
+              <w:top w:w="100" w:type="dxa"/>
+              <w:left w:w="150" w:type="dxa"/>
+              <w:bottom w:w="100" w:type="dxa"/>
+              <w:right w:w="150" w:type="dxa"/>
+            </w:tcMar>
+          </w:tcPr>
+          <w:p>
+            <w:pPr>
+              <w:spacing w:after="0" w:line="276" w:lineRule="auto"/>
+            </w:pPr>
+            <w:r>
+              <w:rPr>
+                <w:rFonts w:ascii="Calibri" w:hAnsi="Calibri"/>
+                <w:b w:val="0"/>
+                <w:color w:val="000000"/>
+                <w:sz w:val="20"/>
+              </w:rPr>
+              <w:t>3</w:t>
+            </w:r>
+          </w:p>
+        </w:tc>
+        <w:tc>
+          <w:tcPr>
+            <w:tcW w:w="1417" w:type="dxa"/>
+            <w:shd w:val="clear" w:color="auto" w:fill="F2F2F2"/>
+            <w:tcMar>
+              <w:top w:w="100" w:type="dxa"/>
+              <w:left w:w="150" w:type="dxa"/>
+              <w:bottom w:w="100" w:type="dxa"/>
+              <w:right w:w="150" w:type="dxa"/>
+            </w:tcMar>
+          </w:tcPr>
+          <w:p>
+            <w:pPr>
+              <w:spacing w:after="0" w:line="276" w:lineRule="auto"/>
+            </w:pPr>
+            <w:r>
+              <w:rPr>
+                <w:rFonts w:ascii="Calibri" w:hAnsi="Calibri"/>
+                <w:b w:val="0"/>
+                <w:color w:val="000000"/>
+                <w:sz w:val="20"/>
+              </w:rPr>
+              <w:t>2</w:t>
+            </w:r>
+          </w:p>
+        </w:tc>
+        <w:tc>
+          <w:tcPr>
+            <w:tcW w:w="1417" w:type="dxa"/>
+            <w:shd w:val="clear" w:color="auto" w:fill="F2F2F2"/>
+            <w:tcMar>
+              <w:top w:w="100" w:type="dxa"/>
+              <w:left w:w="150" w:type="dxa"/>
+              <w:bottom w:w="100" w:type="dxa"/>
+              <w:right w:w="150" w:type="dxa"/>
+            </w:tcMar>
+          </w:tcPr>
+          <w:p>
+            <w:pPr>
+              <w:spacing w:after="0" w:line="276" w:lineRule="auto"/>
+            </w:pPr>
+            <w:r>
+              <w:rPr>
+                <w:rFonts w:ascii="Calibri" w:hAnsi="Calibri"/>
+                <w:b w:val="0"/>
+                <w:color w:val="000000"/>
+                <w:sz w:val="20"/>
+              </w:rPr>
+              <w:t>1</w:t>
+            </w:r>
+          </w:p>
+        </w:tc>
+        <w:tc>
+          <w:tcPr>
+            <w:tcW w:w="1417" w:type="dxa"/>
+            <w:shd w:val="clear" w:color="auto" w:fill="F2F2F2"/>
+            <w:tcMar>
+              <w:top w:w="100" w:type="dxa"/>
+              <w:left w:w="150" w:type="dxa"/>
+              <w:bottom w:w="100" w:type="dxa"/>
+              <w:right w:w="150" w:type="dxa"/>
+            </w:tcMar>
+          </w:tcPr>
+          <w:p>
+            <w:pPr>
+              <w:spacing w:after="0" w:line="276" w:lineRule="auto"/>
+            </w:pPr>
+            <w:r>
+              <w:rPr>
+                <w:rFonts w:ascii="Calibri" w:hAnsi="Calibri"/>
+                <w:b w:val="0"/>
+                <w:color w:val="000000"/>
+                <w:sz w:val="20"/>
+              </w:rPr>
+              <w:t>0</w:t>
+            </w:r>
+          </w:p>
+        </w:tc>
+      </w:tr>
+      <w:tr>
+        <w:trPr>
+          <w:cantSplit/>
+          <w:jc w:val="center"/>
+        </w:trPr>
+        <w:tc>
+          <w:tcPr>
+            <w:tcW w:w="2268" w:type="dxa"/>
             <w:shd w:val="clear" w:color="auto" w:fill="FFFFFF"/>
             <w:tcMar>
               <w:top w:w="100" w:type="dxa"/>
@@ -14440,9 +14575,13 @@
             </w:tcMar>
           </w:tcPr>
           <w:p>
-            <w:r>
-              <w:rPr>
-                <w:rFonts w:ascii="Calibri" w:hAnsi="Calibri"/>
+            <w:pPr>
+              <w:spacing w:after="0" w:line="276" w:lineRule="auto"/>
+            </w:pPr>
+            <w:r>
+              <w:rPr>
+                <w:rFonts w:ascii="Calibri" w:hAnsi="Calibri"/>
+                <w:b/>
                 <w:color w:val="000000"/>
                 <w:sz w:val="20"/>
               </w:rPr>
@@ -14462,9 +14601,13 @@
             </w:tcMar>
           </w:tcPr>
           <w:p>
-            <w:r>
-              <w:rPr>
-                <w:rFonts w:ascii="Calibri" w:hAnsi="Calibri"/>
+            <w:pPr>
+              <w:spacing w:after="0" w:line="276" w:lineRule="auto"/>
+            </w:pPr>
+            <w:r>
+              <w:rPr>
+                <w:rFonts w:ascii="Calibri" w:hAnsi="Calibri"/>
+                <w:b/>
                 <w:color w:val="000000"/>
                 <w:sz w:val="20"/>
               </w:rPr>
@@ -14484,9 +14627,13 @@
             </w:tcMar>
           </w:tcPr>
           <w:p>
-            <w:r>
-              <w:rPr>
-                <w:rFonts w:ascii="Calibri" w:hAnsi="Calibri"/>
+            <w:pPr>
+              <w:spacing w:after="0" w:line="276" w:lineRule="auto"/>
+            </w:pPr>
+            <w:r>
+              <w:rPr>
+                <w:rFonts w:ascii="Calibri" w:hAnsi="Calibri"/>
+                <w:b/>
                 <w:color w:val="000000"/>
                 <w:sz w:val="20"/>
               </w:rPr>
@@ -14506,13 +14653,17 @@
             </w:tcMar>
           </w:tcPr>
           <w:p>
-            <w:r>
-              <w:rPr>
-                <w:rFonts w:ascii="Calibri" w:hAnsi="Calibri"/>
-                <w:color w:val="000000"/>
-                <w:sz w:val="20"/>
-              </w:rPr>
-              <w:t>1</w:t>
+            <w:pPr>
+              <w:spacing w:after="0" w:line="276" w:lineRule="auto"/>
+            </w:pPr>
+            <w:r>
+              <w:rPr>
+                <w:rFonts w:ascii="Calibri" w:hAnsi="Calibri"/>
+                <w:b/>
+                <w:color w:val="000000"/>
+                <w:sz w:val="20"/>
+              </w:rPr>
+              <w:t>2</w:t>
             </w:r>
           </w:p>
         </w:tc>
@@ -14528,13 +14679,17 @@
             </w:tcMar>
           </w:tcPr>
           <w:p>
-            <w:r>
-              <w:rPr>
-                <w:rFonts w:ascii="Calibri" w:hAnsi="Calibri"/>
-                <w:color w:val="000000"/>
-                <w:sz w:val="20"/>
-              </w:rPr>
-              <w:t>2</w:t>
+            <w:pPr>
+              <w:spacing w:after="0" w:line="276" w:lineRule="auto"/>
+            </w:pPr>
+            <w:r>
+              <w:rPr>
+                <w:rFonts w:ascii="Calibri" w:hAnsi="Calibri"/>
+                <w:b/>
+                <w:color w:val="000000"/>
+                <w:sz w:val="20"/>
+              </w:rPr>
+              <w:t>1</w:t>
             </w:r>
           </w:p>
         </w:tc>
@@ -15163,6 +15318,7 @@
           <w:color w:val="000000"/>
           <w:lang w:val="es-PE"/>
         </w:rPr>
+        <w:lastRenderedPageBreak/>
         <w:t>0 escenarios Fallidos de severidad Alta.</w:t>
       </w:r>
     </w:p>
@@ -15179,7 +15335,6 @@
           <w:color w:val="000000"/>
           <w:sz w:val="28"/>
         </w:rPr>
-        <w:lastRenderedPageBreak/>
         <w:t>Resultado</w:t>
       </w:r>
       <w:proofErr w:type="spellEnd"/>
@@ -15365,12 +15520,7 @@
           </w:tcPr>
           <w:p>
             <w:r>
-              <w:rPr>
-                <w:rFonts w:ascii="Calibri" w:hAnsi="Calibri"/>
-                <w:color w:val="000000"/>
-                <w:sz w:val="20"/>
-              </w:rPr>
-              <w:t>1</w:t>
+              <w:t>2</w:t>
             </w:r>
           </w:p>
         </w:tc>
@@ -15415,12 +15565,7 @@
           </w:tcPr>
           <w:p>
             <w:r>
-              <w:rPr>
-                <w:rFonts w:ascii="Calibri" w:hAnsi="Calibri"/>
-                <w:color w:val="000000"/>
-                <w:sz w:val="20"/>
-              </w:rPr>
-              <w:t>2</w:t>
+              <w:t>1</w:t>
             </w:r>
           </w:p>
         </w:tc>

</xml_diff>